<commit_message>
Evidencias de sistema: portal desplegado en Vercel; actualiza 2.4 y 2.6
</commit_message>
<xml_diff>
--- a/fase 2/Evidencias Grupales/2.4_GuiaEstudiante_Fase 2_DesarrolloProyecto APT (Español).docx
+++ b/fase 2/Evidencias Grupales/2.4_GuiaEstudiante_Fase 2_DesarrolloProyecto APT (Español).docx
@@ -111,17 +111,17 @@
         <w:t xml:space="preserve">Avance medido al 28-10-2026: 32 %</w:t>
       </w:r>
       <w:r>
-        <w:t xml:space="preserve"> del backlog del equipo (23 de 72 tickets y 115 de 355 Story Points, verificados en el historial de git). Los bloques 1 y 2 están cerrados: el entorno de pruebas local reproducible, el CI unificado y las suites de aislamiento multi-tenant (RLS), roles de base de datos, JWT, RBAC, secretos, migraciones y aislamiento de logs. El bloque 3 (motor de generación de pruebas con IA) está en curso. La Consola de Administración (E6) </w:t>
-      </w:r>
-      <w:r>
-        <w:rPr>
-          <w:b/>
-          <w:bCs/>
-        </w:rPr>
-        <w:t xml:space="preserve">no ha iniciado su desarrollo</w:t>
-      </w:r>
-      <w:r>
-        <w:t xml:space="preserve">.</w:t>
+        <w:t xml:space="preserve"> del backlog del equipo (23 de 72 tickets y 115 de 355 Story Points, verificados en el historial de git). Los bloques 1 y 2 están cerrados: el entorno de pruebas local reproducible, el CI unificado y las suites de aislamiento multi-tenant (RLS), roles de base de datos, JWT, RBAC, secretos, migraciones y aislamiento de logs. El bloque 3 (motor de generación de pruebas con IA) está en curso. La Consola de Administración (E6) está en </w:t>
+      </w:r>
+      <w:r>
+        <w:rPr>
+          <w:b/>
+          <w:bCs/>
+        </w:rPr>
+        <w:t xml:space="preserve">etapa inicial</w:t>
+      </w:r>
+      <w:r>
+        <w:t xml:space="preserve">: se creó su repositorio (kallicode-admin), con un desarrollo todavía incipiente.</w:t>
       </w:r>
     </w:p>
     <w:p>
@@ -415,7 +415,7 @@
         <w:t xml:space="preserve">Evidencias de sistema:</w:t>
       </w:r>
       <w:r>
-        <w:t xml:space="preserve"> guía de instalación y ejecución, script DDL consolidado de la base de datos (60 tablas, 37 migraciones).</w:t>
+        <w:t xml:space="preserve"> Portal Cliente desplegado en Vercel (kallicode-backend.vercel.app) con capturas del tablero y de los tickets, guía de instalación y ejecución, y script DDL consolidado de la base de datos (60 tablas, 37 migraciones).</w:t>
       </w:r>
     </w:p>
     <w:p>
@@ -1722,7 +1722,7 @@
                 <w:sz w:val="17"/>
                 <w:szCs w:val="17"/>
               </w:rPr>
-              <w:t xml:space="preserve">No iniciado</w:t>
+              <w:t xml:space="preserve">Etapa inicial</w:t>
             </w:r>
           </w:p>
         </w:tc>
@@ -1748,7 +1748,7 @@
                 <w:sz w:val="17"/>
                 <w:szCs w:val="17"/>
               </w:rPr>
-              <w:t xml:space="preserve">Depende del rol de lectura cross-tenant (E5)</w:t>
+              <w:t xml:space="preserve">Repositorio kallicode-admin creado; depende del rol de lectura cross-tenant (E5)</w:t>
             </w:r>
           </w:p>
         </w:tc>
@@ -2180,7 +2180,7 @@
         <w:t xml:space="preserve">Decisión de despliegue:</w:t>
       </w:r>
       <w:r>
-        <w:t xml:space="preserve"> Vercel para frontend y backend, y Supabase como base de datos externa (plan gratuito), considerando los límites del plan gratuito de Vercel (~4,5 MB por payload y 100 MB de archivos estáticos).</w:t>
+        <w:t xml:space="preserve"> Vercel para frontend y backend, y Supabase como base de datos externa (plan gratuito), considerando los límites del plan gratuito de Vercel (~4,5 MB por payload y 100 MB de archivos estáticos). Esta decisión ya se ejecutó: el core de KalliCode está desplegado y operativo en Vercel (verificado el 29-10-2026).</w:t>
       </w:r>
     </w:p>
     <w:p>
@@ -2308,7 +2308,7 @@
         <w:t xml:space="preserve">Consola de Administración (E6):</w:t>
       </w:r>
       <w:r>
-        <w:t xml:space="preserve"> no iniciada. Su construcción requiere primero el rol de lectura cross-tenant y la identidad de personal, que son responsabilidad de E5; se replanificará en el siguiente bloque.</w:t>
+        <w:t xml:space="preserve"> retrasada. Se creó el repositorio kallicode-admin, pero el desarrollo es incipiente; además requiere el rol de lectura cross-tenant y la identidad de personal, responsabilidad de E5. Se replanificará en el siguiente bloque.</w:t>
       </w:r>
     </w:p>
     <w:p>

</xml_diff>

<commit_message>
Resultados de pruebas E-02: 62/62 aprobadas, cobertura 89,7%; guía para ejecutar la suite
</commit_message>
<xml_diff>
--- a/fase 2/Evidencias Grupales/2.4_GuiaEstudiante_Fase 2_DesarrolloProyecto APT (Español).docx
+++ b/fase 2/Evidencias Grupales/2.4_GuiaEstudiante_Fase 2_DesarrolloProyecto APT (Español).docx
@@ -139,7 +139,27 @@
         <w:t xml:space="preserve">siete hallazgos de calidad</w:t>
       </w:r>
       <w:r>
-        <w:t xml:space="preserve"> (H-01 a H-07), entre ellos un defecto real en la clasificación de severidad de las escalaciones de seguridad que la prueba existente no detectaba.</w:t>
+        <w:t xml:space="preserve"> (H-01 a H-07), entre ellos un defecto real en la clasificación de severidad de las escalaciones de seguridad que la prueba existente no detectaba. Además, la suite automatizada del equipo se ejecutó completa en un entorno local reproducible: </w:t>
+      </w:r>
+      <w:r>
+        <w:rPr>
+          <w:b/>
+          <w:bCs/>
+        </w:rPr>
+        <w:t xml:space="preserve">62 de 62 pruebas aprobadas</w:t>
+      </w:r>
+      <w:r>
+        <w:t xml:space="preserve"> y </w:t>
+      </w:r>
+      <w:r>
+        <w:rPr>
+          <w:b/>
+          <w:bCs/>
+        </w:rPr>
+        <w:t xml:space="preserve">89,7 % de cobertura</w:t>
+      </w:r>
+      <w:r>
+        <w:t xml:space="preserve"> del módulo de pruebas.</w:t>
       </w:r>
     </w:p>
     <w:p>
@@ -373,7 +393,7 @@
         <w:t xml:space="preserve">Pruebas:</w:t>
       </w:r>
       <w:r>
-        <w:t xml:space="preserve"> plan de pruebas, 16 casos de prueba que cubren 46 pruebas automatizadas y resultados con hallazgos H-01 a H-07.</w:t>
+        <w:t xml:space="preserve"> plan de pruebas, 16 casos de prueba que cubren 46 pruebas automatizadas y resultados de la ejecución completa (62 de 62 aprobadas, commit 3a0a9e6, con reporte JUnit y captura) y hallazgos H-01 a H-08.</w:t>
       </w:r>
     </w:p>
     <w:p>
@@ -415,7 +435,7 @@
         <w:t xml:space="preserve">Evidencias de sistema:</w:t>
       </w:r>
       <w:r>
-        <w:t xml:space="preserve"> Portal Cliente desplegado en Vercel (kallicode-backend.vercel.app) con capturas del tablero y de los tickets, guía de instalación y ejecución, y script DDL consolidado de la base de datos (60 tablas, 37 migraciones).</w:t>
+        <w:t xml:space="preserve"> Portal Cliente desplegado en Vercel (kallicode-backend.vercel.app) con capturas del tablero y de los tickets, guía de instalación y ejecución, y script DDL consolidado de la base de datos (60 tablas, 32 migraciones versionadas).</w:t>
       </w:r>
     </w:p>
     <w:p>
@@ -1066,7 +1086,7 @@
                 <w:sz w:val="17"/>
                 <w:szCs w:val="17"/>
               </w:rPr>
-              <w:t xml:space="preserve">Plan, casos y resultados de pruebas; análisis estático y registro de hallazgos H-01 a H-07</w:t>
+              <w:t xml:space="preserve">Plan, casos y resultados de pruebas; análisis estático y registro de hallazgos H-01 a H-08</w:t>
             </w:r>
           </w:p>
         </w:tc>
@@ -1092,7 +1112,7 @@
                 <w:sz w:val="17"/>
                 <w:szCs w:val="17"/>
               </w:rPr>
-              <w:t xml:space="preserve">Suite de pruebas, análisis del código fuente</w:t>
+              <w:t xml:space="preserve">pytest, cobertura, análisis del código fuente</w:t>
             </w:r>
           </w:p>
         </w:tc>
@@ -1118,7 +1138,7 @@
                 <w:sz w:val="17"/>
                 <w:szCs w:val="17"/>
               </w:rPr>
-              <w:t xml:space="preserve">27-oct a 31-oct</w:t>
+              <w:t xml:space="preserve">27-oct a 30-oct</w:t>
             </w:r>
           </w:p>
         </w:tc>
@@ -1170,7 +1190,7 @@
                 <w:sz w:val="17"/>
                 <w:szCs w:val="17"/>
               </w:rPr>
-              <w:t xml:space="preserve">En curso</w:t>
+              <w:t xml:space="preserve">Completado</w:t>
             </w:r>
           </w:p>
         </w:tc>
@@ -1196,7 +1216,7 @@
                 <w:sz w:val="17"/>
                 <w:szCs w:val="17"/>
               </w:rPr>
-              <w:t xml:space="preserve">Falta registrar la ejecución completa de la suite (E-02)</w:t>
+              <w:t xml:space="preserve">Ejecución E-02: 62/62 aprobadas, cobertura 89,7 %</w:t>
             </w:r>
           </w:p>
         </w:tc>
@@ -2330,27 +2350,6 @@
       </w:r>
       <w:r>
         <w:t xml:space="preserve"> en curso, sin tickets cerrados al 28-10. A la velocidad medida (~57 SP por bloque) quedan 240 SP para cuatro bloques, por lo que cualquier retraso en B3 compromete el cierre en diciembre.</w:t>
-      </w:r>
-    </w:p>
-    <w:p>
-      <w:pPr>
-        <w:pStyle w:val="ListParagraph"/>
-        <w:numPr>
-          <w:ilvl w:val="0"/>
-          <w:numId w:val="2"/>
-        </w:numPr>
-        <w:spacing w:after="60"/>
-        <w:jc w:val="left"/>
-      </w:pPr>
-      <w:r>
-        <w:rPr>
-          <w:b/>
-          <w:bCs/>
-        </w:rPr>
-        <w:t xml:space="preserve">Registro completo de resultados de pruebas:</w:t>
-      </w:r>
-      <w:r>
-        <w:t xml:space="preserve"> pendiente la ejecución de la suite completa con reporte versionado.</w:t>
       </w:r>
     </w:p>
     <w:p>

</xml_diff>